<commit_message>
Refactor coauthor expansion and remove duplicates
Update DocumentGenerationService to more robustly expand corresponding-author blocks into co-author entries: locate the first {{corres_name}} occurrence, build the full signature block in one slice when paragraphs are contiguous (fall back to name+role otherwise), and generate coauthor blocks by replacing {{corres_name}} and author-role labels. Simplify role handling by replacing "Corresponding author" and the Thai equivalent with co-author wording (no longer relying on coauthor_role placeholders). Add a post-processing loop to remove leftover/duplicate signature paragraphs for additional {{corres_name}} instances after expansion. Also include an updated binary template (p2doc_9.docx).
</commit_message>
<xml_diff>
--- a/HRCP-KKU-Academic/src/main/resources/templates/docx/Phase2/p2doc_9.docx
+++ b/HRCP-KKU-Academic/src/main/resources/templates/docx/Phase2/p2doc_9.docx
@@ -260,6 +260,14 @@
           <w:rFonts w:ascii="TH Sarabun New" w:hAnsi="TH Sarabun New" w:cs="TH Sarabun New"/>
           <w:sz w:val="32"/>
           <w:szCs w:val="32"/>
+        </w:rPr>
+        <w:tab/>
+      </w:r>
+      <w:r>
+        <w:rPr>
+          <w:rFonts w:ascii="TH Sarabun New" w:hAnsi="TH Sarabun New" w:cs="TH Sarabun New"/>
+          <w:sz w:val="32"/>
+          <w:szCs w:val="32"/>
           <w:cs/>
         </w:rPr>
         <w:t>ผู้ประพันธ์อันดับแรก</w:t>
@@ -685,6 +693,15 @@
           <w:szCs w:val="32"/>
           <w:cs/>
         </w:rPr>
+        <w:t>ผลงานวิชาการเพื่ออุตสาหกรรม</w:t>
+      </w:r>
+      <w:r>
+        <w:rPr>
+          <w:rFonts w:ascii="TH Sarabun New" w:hAnsi="TH Sarabun New" w:cs="TH Sarabun New"/>
+          <w:sz w:val="32"/>
+          <w:szCs w:val="32"/>
+          <w:cs/>
+        </w:rPr>
         <w:tab/>
       </w:r>
       <w:r>
@@ -694,15 +711,6 @@
           <w:szCs w:val="32"/>
           <w:cs/>
         </w:rPr>
-        <w:t>ผลงานวิชาการเพื่ออุตสาหกรรม</w:t>
-      </w:r>
-      <w:r>
-        <w:rPr>
-          <w:rFonts w:ascii="TH Sarabun New" w:hAnsi="TH Sarabun New" w:cs="TH Sarabun New"/>
-          <w:sz w:val="32"/>
-          <w:szCs w:val="32"/>
-          <w:cs/>
-        </w:rPr>
         <w:tab/>
       </w:r>
       <w:r>
@@ -732,6 +740,86 @@
         </w:rPr>
         <w:tab/>
       </w:r>
+    </w:p>
+    <w:p>
+      <w:pPr>
+        <w:spacing w:after="0" w:line="276" w:lineRule="auto"/>
+        <w:rPr>
+          <w:rFonts w:ascii="TH Sarabun New" w:hAnsi="TH Sarabun New" w:cs="TH Sarabun New"/>
+          <w:sz w:val="32"/>
+          <w:szCs w:val="32"/>
+        </w:rPr>
+      </w:pPr>
+      <w:r>
+        <w:rPr>
+          <w:rFonts w:ascii="TH Sarabun New" w:hAnsi="TH Sarabun New" w:cs="TH Sarabun New"/>
+          <w:sz w:val="32"/>
+          <w:szCs w:val="32"/>
+        </w:rPr>
+        <w:t>{{chkgroup2_2}}</w:t>
+      </w:r>
+      <w:r>
+        <w:rPr>
+          <w:rFonts w:ascii="TH Sarabun New" w:hAnsi="TH Sarabun New" w:cs="TH Sarabun New"/>
+          <w:sz w:val="32"/>
+          <w:szCs w:val="32"/>
+          <w:cs/>
+        </w:rPr>
+        <w:t>กรณีศึกษา</w:t>
+      </w:r>
+      <w:r>
+        <w:rPr>
+          <w:rFonts w:ascii="TH Sarabun New" w:hAnsi="TH Sarabun New" w:cs="TH Sarabun New"/>
+          <w:sz w:val="32"/>
+          <w:szCs w:val="32"/>
+          <w:cs/>
+        </w:rPr>
+        <w:t xml:space="preserve"> </w:t>
+      </w:r>
+      <w:r>
+        <w:rPr>
+          <w:rFonts w:ascii="TH Sarabun New" w:hAnsi="TH Sarabun New" w:cs="TH Sarabun New"/>
+          <w:sz w:val="32"/>
+          <w:szCs w:val="32"/>
+          <w:cs/>
+        </w:rPr>
+        <w:t>(</w:t>
+      </w:r>
+      <w:r>
+        <w:rPr>
+          <w:rFonts w:ascii="TH Sarabun New" w:hAnsi="TH Sarabun New" w:cs="TH Sarabun New"/>
+          <w:sz w:val="32"/>
+          <w:szCs w:val="32"/>
+        </w:rPr>
+        <w:t>Case Study)</w:t>
+      </w:r>
+    </w:p>
+    <w:p>
+      <w:pPr>
+        <w:spacing w:after="0" w:line="276" w:lineRule="auto"/>
+        <w:rPr>
+          <w:rFonts w:ascii="TH Sarabun New" w:hAnsi="TH Sarabun New" w:cs="TH Sarabun New"/>
+          <w:sz w:val="32"/>
+          <w:szCs w:val="32"/>
+        </w:rPr>
+      </w:pPr>
+      <w:r>
+        <w:rPr>
+          <w:rFonts w:ascii="TH Sarabun New" w:hAnsi="TH Sarabun New" w:cs="TH Sarabun New"/>
+          <w:sz w:val="32"/>
+          <w:szCs w:val="32"/>
+        </w:rPr>
+        <w:t>{{chkgroup2_3}}</w:t>
+      </w:r>
+      <w:r>
+        <w:rPr>
+          <w:rFonts w:ascii="TH Sarabun New" w:hAnsi="TH Sarabun New" w:cs="TH Sarabun New"/>
+          <w:sz w:val="32"/>
+          <w:szCs w:val="32"/>
+          <w:cs/>
+        </w:rPr>
+        <w:t>ผลงานวิชาการเพื่อพัฒนาการเรียนการสอนและการเรียนรู้</w:t>
+      </w:r>
       <w:r>
         <w:rPr>
           <w:rFonts w:ascii="TH Sarabun New" w:hAnsi="TH Sarabun New" w:cs="TH Sarabun New"/>
@@ -746,53 +834,10 @@
           <w:rFonts w:ascii="TH Sarabun New" w:hAnsi="TH Sarabun New" w:cs="TH Sarabun New"/>
           <w:sz w:val="32"/>
           <w:szCs w:val="32"/>
-        </w:rPr>
-        <w:t>{{chkgroup2_2}}</w:t>
-      </w:r>
-      <w:r>
-        <w:rPr>
-          <w:rFonts w:ascii="TH Sarabun New" w:hAnsi="TH Sarabun New" w:cs="TH Sarabun New"/>
-          <w:sz w:val="32"/>
-          <w:szCs w:val="32"/>
           <w:cs/>
         </w:rPr>
         <w:tab/>
       </w:r>
-      <w:r>
-        <w:rPr>
-          <w:rFonts w:ascii="TH Sarabun New" w:hAnsi="TH Sarabun New" w:cs="TH Sarabun New"/>
-          <w:sz w:val="32"/>
-          <w:szCs w:val="32"/>
-          <w:cs/>
-        </w:rPr>
-        <w:t>กรณีศึกษา</w:t>
-      </w:r>
-      <w:r>
-        <w:rPr>
-          <w:rFonts w:ascii="TH Sarabun New" w:hAnsi="TH Sarabun New" w:cs="TH Sarabun New"/>
-          <w:sz w:val="32"/>
-          <w:szCs w:val="32"/>
-          <w:cs/>
-        </w:rPr>
-        <w:t xml:space="preserve"> </w:t>
-      </w:r>
-      <w:r>
-        <w:rPr>
-          <w:rFonts w:ascii="TH Sarabun New" w:hAnsi="TH Sarabun New" w:cs="TH Sarabun New"/>
-          <w:sz w:val="32"/>
-          <w:szCs w:val="32"/>
-          <w:cs/>
-        </w:rPr>
-        <w:t>(</w:t>
-      </w:r>
-      <w:r>
-        <w:rPr>
-          <w:rFonts w:ascii="TH Sarabun New" w:hAnsi="TH Sarabun New" w:cs="TH Sarabun New"/>
-          <w:sz w:val="32"/>
-          <w:szCs w:val="32"/>
-        </w:rPr>
-        <w:t>Case Study)</w:t>
-      </w:r>
     </w:p>
     <w:p>
       <w:pPr>
@@ -809,13 +854,50 @@
           <w:sz w:val="32"/>
           <w:szCs w:val="32"/>
         </w:rPr>
-        <w:t>{{chkgroup2_3}}</w:t>
-      </w:r>
-      <w:r>
-        <w:rPr>
-          <w:rFonts w:ascii="TH Sarabun New" w:hAnsi="TH Sarabun New" w:cs="TH Sarabun New"/>
-          <w:sz w:val="32"/>
-          <w:szCs w:val="32"/>
+        <w:t>{{chkgroup2_4}}</w:t>
+      </w:r>
+      <w:r>
+        <w:rPr>
+          <w:rFonts w:ascii="TH Sarabun New" w:hAnsi="TH Sarabun New" w:cs="TH Sarabun New"/>
+          <w:sz w:val="32"/>
+          <w:szCs w:val="32"/>
+          <w:cs/>
+        </w:rPr>
+        <w:t>งานแปล</w:t>
+      </w:r>
+    </w:p>
+    <w:p>
+      <w:pPr>
+        <w:spacing w:after="0" w:line="276" w:lineRule="auto"/>
+        <w:rPr>
+          <w:rFonts w:ascii="TH Sarabun New" w:hAnsi="TH Sarabun New" w:cs="TH Sarabun New"/>
+          <w:sz w:val="32"/>
+          <w:szCs w:val="32"/>
+        </w:rPr>
+      </w:pPr>
+      <w:r>
+        <w:rPr>
+          <w:rFonts w:ascii="TH Sarabun New" w:hAnsi="TH Sarabun New" w:cs="TH Sarabun New"/>
+          <w:sz w:val="32"/>
+          <w:szCs w:val="32"/>
+        </w:rPr>
+        <w:t>{{chkgroup2_5}}</w:t>
+      </w:r>
+      <w:r>
+        <w:rPr>
+          <w:rFonts w:ascii="TH Sarabun New" w:hAnsi="TH Sarabun New" w:cs="TH Sarabun New"/>
+          <w:sz w:val="32"/>
+          <w:szCs w:val="32"/>
+          <w:cs/>
+        </w:rPr>
+        <w:t>ผลงานวิชาการเพื่อพัฒนานโยบายสาธารณะ</w:t>
+      </w:r>
+      <w:r>
+        <w:rPr>
+          <w:rFonts w:ascii="TH Sarabun New" w:hAnsi="TH Sarabun New" w:cs="TH Sarabun New"/>
+          <w:sz w:val="32"/>
+          <w:szCs w:val="32"/>
+          <w:cs/>
         </w:rPr>
         <w:tab/>
       </w:r>
@@ -826,52 +908,8 @@
           <w:szCs w:val="32"/>
           <w:cs/>
         </w:rPr>
-        <w:t>ผลงานวิชาการเพื่อพัฒนาการเรียนการสอนและการเรียนรู้</w:t>
-      </w:r>
-      <w:r>
-        <w:rPr>
-          <w:rFonts w:ascii="TH Sarabun New" w:hAnsi="TH Sarabun New" w:cs="TH Sarabun New"/>
-          <w:sz w:val="32"/>
-          <w:szCs w:val="32"/>
-          <w:cs/>
-        </w:rPr>
         <w:tab/>
       </w:r>
-      <w:r>
-        <w:rPr>
-          <w:rFonts w:ascii="TH Sarabun New" w:hAnsi="TH Sarabun New" w:cs="TH Sarabun New"/>
-          <w:sz w:val="32"/>
-          <w:szCs w:val="32"/>
-          <w:cs/>
-        </w:rPr>
-        <w:tab/>
-      </w:r>
-      <w:r>
-        <w:rPr>
-          <w:rFonts w:ascii="TH Sarabun New" w:hAnsi="TH Sarabun New" w:cs="TH Sarabun New"/>
-          <w:sz w:val="32"/>
-          <w:szCs w:val="32"/>
-        </w:rPr>
-        <w:t>{{chkgroup2_4}}</w:t>
-      </w:r>
-      <w:r>
-        <w:rPr>
-          <w:rFonts w:ascii="TH Sarabun New" w:hAnsi="TH Sarabun New" w:cs="TH Sarabun New"/>
-          <w:sz w:val="32"/>
-          <w:szCs w:val="32"/>
-          <w:cs/>
-        </w:rPr>
-        <w:tab/>
-      </w:r>
-      <w:r>
-        <w:rPr>
-          <w:rFonts w:ascii="TH Sarabun New" w:hAnsi="TH Sarabun New" w:cs="TH Sarabun New"/>
-          <w:sz w:val="32"/>
-          <w:szCs w:val="32"/>
-          <w:cs/>
-        </w:rPr>
-        <w:t>งานแปล</w:t>
-      </w:r>
     </w:p>
     <w:p>
       <w:pPr>
@@ -888,69 +926,7 @@
           <w:sz w:val="32"/>
           <w:szCs w:val="32"/>
         </w:rPr>
-        <w:t>{{chkgroup2_5}}</w:t>
-      </w:r>
-      <w:r>
-        <w:rPr>
-          <w:rFonts w:ascii="TH Sarabun New" w:hAnsi="TH Sarabun New" w:cs="TH Sarabun New"/>
-          <w:sz w:val="32"/>
-          <w:szCs w:val="32"/>
-          <w:cs/>
-        </w:rPr>
-        <w:tab/>
-      </w:r>
-      <w:r>
-        <w:rPr>
-          <w:rFonts w:ascii="TH Sarabun New" w:hAnsi="TH Sarabun New" w:cs="TH Sarabun New"/>
-          <w:sz w:val="32"/>
-          <w:szCs w:val="32"/>
-          <w:cs/>
-        </w:rPr>
-        <w:t>ผลงานวิชาการเพื่อพัฒนานโยบายสาธารณะ</w:t>
-      </w:r>
-      <w:r>
-        <w:rPr>
-          <w:rFonts w:ascii="TH Sarabun New" w:hAnsi="TH Sarabun New" w:cs="TH Sarabun New"/>
-          <w:sz w:val="32"/>
-          <w:szCs w:val="32"/>
-          <w:cs/>
-        </w:rPr>
-        <w:tab/>
-      </w:r>
-      <w:r>
-        <w:rPr>
-          <w:rFonts w:ascii="TH Sarabun New" w:hAnsi="TH Sarabun New" w:cs="TH Sarabun New"/>
-          <w:sz w:val="32"/>
-          <w:szCs w:val="32"/>
-          <w:cs/>
-        </w:rPr>
-        <w:tab/>
-      </w:r>
-      <w:r>
-        <w:rPr>
-          <w:rFonts w:ascii="TH Sarabun New" w:hAnsi="TH Sarabun New" w:cs="TH Sarabun New"/>
-          <w:sz w:val="32"/>
-          <w:szCs w:val="32"/>
-          <w:cs/>
-        </w:rPr>
-        <w:tab/>
-      </w:r>
-      <w:r>
-        <w:rPr>
-          <w:rFonts w:ascii="TH Sarabun New" w:hAnsi="TH Sarabun New" w:cs="TH Sarabun New"/>
-          <w:sz w:val="32"/>
-          <w:szCs w:val="32"/>
-        </w:rPr>
         <w:t>{{chkgroup2_6}}</w:t>
-      </w:r>
-      <w:r>
-        <w:rPr>
-          <w:rFonts w:ascii="TH Sarabun New" w:hAnsi="TH Sarabun New" w:cs="TH Sarabun New"/>
-          <w:sz w:val="32"/>
-          <w:szCs w:val="32"/>
-          <w:cs/>
-        </w:rPr>
-        <w:tab/>
       </w:r>
       <w:r>
         <w:rPr>
@@ -995,16 +971,114 @@
           <w:szCs w:val="32"/>
           <w:cs/>
         </w:rPr>
+        <w:t>ผลงานสร้างสรรค์ด้านวิทยาศาสตร์และเทคโนโลยี</w:t>
+      </w:r>
+      <w:r>
+        <w:rPr>
+          <w:rFonts w:ascii="TH Sarabun New" w:hAnsi="TH Sarabun New" w:cs="TH Sarabun New"/>
+          <w:sz w:val="32"/>
+          <w:szCs w:val="32"/>
+          <w:cs/>
+        </w:rPr>
         <w:tab/>
       </w:r>
-      <w:r>
-        <w:rPr>
-          <w:rFonts w:ascii="TH Sarabun New" w:hAnsi="TH Sarabun New" w:cs="TH Sarabun New"/>
-          <w:sz w:val="32"/>
-          <w:szCs w:val="32"/>
-          <w:cs/>
-        </w:rPr>
-        <w:t>ผลงานสร้างสรรค์ด้านวิทยาศาสตร์และเทคโนโลยี</w:t>
+    </w:p>
+    <w:p>
+      <w:pPr>
+        <w:tabs>
+          <w:tab w:val="left" w:pos="720"/>
+          <w:tab w:val="left" w:pos="1440"/>
+          <w:tab w:val="left" w:pos="2160"/>
+          <w:tab w:val="left" w:pos="2880"/>
+          <w:tab w:val="left" w:pos="3600"/>
+          <w:tab w:val="left" w:pos="4320"/>
+          <w:tab w:val="left" w:pos="6150"/>
+        </w:tabs>
+        <w:spacing w:after="0" w:line="276" w:lineRule="auto"/>
+        <w:rPr>
+          <w:rFonts w:ascii="TH Sarabun New" w:hAnsi="TH Sarabun New" w:cs="TH Sarabun New"/>
+          <w:sz w:val="32"/>
+          <w:szCs w:val="32"/>
+        </w:rPr>
+      </w:pPr>
+      <w:r>
+        <w:rPr>
+          <w:rFonts w:ascii="TH Sarabun New" w:hAnsi="TH Sarabun New" w:cs="TH Sarabun New"/>
+          <w:sz w:val="32"/>
+          <w:szCs w:val="32"/>
+        </w:rPr>
+        <w:t>{{chkgroup2_8}}</w:t>
+      </w:r>
+      <w:r>
+        <w:rPr>
+          <w:rFonts w:ascii="TH Sarabun New" w:hAnsi="TH Sarabun New" w:cs="TH Sarabun New"/>
+          <w:sz w:val="32"/>
+          <w:szCs w:val="32"/>
+          <w:cs/>
+        </w:rPr>
+        <w:t>ซอฟต์แวร์</w:t>
+      </w:r>
+    </w:p>
+    <w:p>
+      <w:pPr>
+        <w:spacing w:after="0" w:line="276" w:lineRule="auto"/>
+        <w:rPr>
+          <w:rFonts w:ascii="TH Sarabun New" w:hAnsi="TH Sarabun New" w:cs="TH Sarabun New"/>
+          <w:sz w:val="32"/>
+          <w:szCs w:val="32"/>
+        </w:rPr>
+      </w:pPr>
+      <w:r>
+        <w:rPr>
+          <w:rFonts w:ascii="TH Sarabun New" w:hAnsi="TH Sarabun New" w:cs="TH Sarabun New"/>
+          <w:sz w:val="32"/>
+          <w:szCs w:val="32"/>
+        </w:rPr>
+        <w:t>{{chkgroup2_9}</w:t>
+      </w:r>
+      <w:r>
+        <w:rPr>
+          <w:rFonts w:ascii="TH Sarabun New" w:hAnsi="TH Sarabun New" w:cs="TH Sarabun New"/>
+          <w:sz w:val="32"/>
+          <w:szCs w:val="32"/>
+        </w:rPr>
+        <w:t>}</w:t>
+      </w:r>
+      <w:r>
+        <w:rPr>
+          <w:rFonts w:ascii="TH Sarabun New" w:hAnsi="TH Sarabun New" w:cs="TH Sarabun New"/>
+          <w:sz w:val="32"/>
+          <w:szCs w:val="32"/>
+          <w:cs/>
+        </w:rPr>
+        <w:t>พจนานุกรม สารานุกรม นามานุกรม และงานวิชาการในลักษณะเดียวกัน</w:t>
+      </w:r>
+    </w:p>
+    <w:p>
+      <w:pPr>
+        <w:spacing w:after="0" w:line="276" w:lineRule="auto"/>
+        <w:rPr>
+          <w:rFonts w:ascii="TH Sarabun New" w:hAnsi="TH Sarabun New" w:cs="TH Sarabun New"/>
+          <w:sz w:val="32"/>
+          <w:szCs w:val="32"/>
+        </w:rPr>
+      </w:pPr>
+      <w:r>
+        <w:rPr>
+          <w:rFonts w:ascii="TH Sarabun New" w:hAnsi="TH Sarabun New" w:cs="TH Sarabun New"/>
+          <w:sz w:val="32"/>
+          <w:szCs w:val="32"/>
+        </w:rPr>
+        <w:t>{{chkgroup2_10}}</w:t>
+      </w:r>
+      <w:r>
+        <w:rPr>
+          <w:rFonts w:ascii="TH Sarabun New" w:hAnsi="TH Sarabun New" w:cs="TH Sarabun New"/>
+          <w:sz w:val="32"/>
+          <w:szCs w:val="32"/>
+          <w:cs/>
+        </w:rPr>
+        <w:t>ผลงานสร้างสรรค์ด้านสุนทรียะ ศิลปะ</w:t>
       </w:r>
       <w:r>
         <w:rPr>
@@ -1029,14 +1103,6 @@
           <w:rFonts w:ascii="TH Sarabun New" w:hAnsi="TH Sarabun New" w:cs="TH Sarabun New"/>
           <w:sz w:val="32"/>
           <w:szCs w:val="32"/>
-        </w:rPr>
-        <w:t>{{chkgroup2_8}}</w:t>
-      </w:r>
-      <w:r>
-        <w:rPr>
-          <w:rFonts w:ascii="TH Sarabun New" w:hAnsi="TH Sarabun New" w:cs="TH Sarabun New"/>
-          <w:sz w:val="32"/>
-          <w:szCs w:val="32"/>
           <w:cs/>
         </w:rPr>
         <w:tab/>
@@ -1048,7 +1114,7 @@
           <w:szCs w:val="32"/>
           <w:cs/>
         </w:rPr>
-        <w:t>ซอฟต์แวร์</w:t>
+        <w:tab/>
       </w:r>
     </w:p>
     <w:p>
@@ -1066,25 +1132,16 @@
           <w:sz w:val="32"/>
           <w:szCs w:val="32"/>
         </w:rPr>
-        <w:t>{{chkgroup2_9}}</w:t>
-      </w:r>
-      <w:r>
-        <w:rPr>
-          <w:rFonts w:ascii="TH Sarabun New" w:hAnsi="TH Sarabun New" w:cs="TH Sarabun New"/>
-          <w:sz w:val="32"/>
-          <w:szCs w:val="32"/>
-          <w:cs/>
-        </w:rPr>
-        <w:tab/>
-      </w:r>
-      <w:r>
-        <w:rPr>
-          <w:rFonts w:ascii="TH Sarabun New" w:hAnsi="TH Sarabun New" w:cs="TH Sarabun New"/>
-          <w:sz w:val="32"/>
-          <w:szCs w:val="32"/>
-          <w:cs/>
-        </w:rPr>
-        <w:t>พจนานุกรม สารานุกรม นามานุกรม และงานวิชาการในลักษณะเดียวกัน</w:t>
+        <w:t>{{chkgroup2_11}}</w:t>
+      </w:r>
+      <w:r>
+        <w:rPr>
+          <w:rFonts w:ascii="TH Sarabun New" w:hAnsi="TH Sarabun New" w:cs="TH Sarabun New"/>
+          <w:sz w:val="32"/>
+          <w:szCs w:val="32"/>
+          <w:cs/>
+        </w:rPr>
+        <w:t>ผลงานนวัตกรรม</w:t>
       </w:r>
     </w:p>
     <w:p>
@@ -1102,87 +1159,16 @@
           <w:sz w:val="32"/>
           <w:szCs w:val="32"/>
         </w:rPr>
-        <w:t>{{chkgroup2_10}}</w:t>
-      </w:r>
-      <w:r>
-        <w:rPr>
-          <w:rFonts w:ascii="TH Sarabun New" w:hAnsi="TH Sarabun New" w:cs="TH Sarabun New"/>
-          <w:sz w:val="32"/>
-          <w:szCs w:val="32"/>
-          <w:cs/>
-        </w:rPr>
-        <w:tab/>
-      </w:r>
-      <w:r>
-        <w:rPr>
-          <w:rFonts w:ascii="TH Sarabun New" w:hAnsi="TH Sarabun New" w:cs="TH Sarabun New"/>
-          <w:sz w:val="32"/>
-          <w:szCs w:val="32"/>
-          <w:cs/>
-        </w:rPr>
-        <w:t>ผลงานสร้างสรรค์ด้านสุนทรียะ ศิลปะ</w:t>
-      </w:r>
-      <w:r>
-        <w:rPr>
-          <w:rFonts w:ascii="TH Sarabun New" w:hAnsi="TH Sarabun New" w:cs="TH Sarabun New"/>
-          <w:sz w:val="32"/>
-          <w:szCs w:val="32"/>
-          <w:cs/>
-        </w:rPr>
-        <w:tab/>
-      </w:r>
-      <w:r>
-        <w:rPr>
-          <w:rFonts w:ascii="TH Sarabun New" w:hAnsi="TH Sarabun New" w:cs="TH Sarabun New"/>
-          <w:sz w:val="32"/>
-          <w:szCs w:val="32"/>
-          <w:cs/>
-        </w:rPr>
-        <w:tab/>
-      </w:r>
-      <w:r>
-        <w:rPr>
-          <w:rFonts w:ascii="TH Sarabun New" w:hAnsi="TH Sarabun New" w:cs="TH Sarabun New"/>
-          <w:sz w:val="32"/>
-          <w:szCs w:val="32"/>
-          <w:cs/>
-        </w:rPr>
-        <w:tab/>
-      </w:r>
-      <w:r>
-        <w:rPr>
-          <w:rFonts w:ascii="TH Sarabun New" w:hAnsi="TH Sarabun New" w:cs="TH Sarabun New"/>
-          <w:sz w:val="32"/>
-          <w:szCs w:val="32"/>
-          <w:cs/>
-        </w:rPr>
-        <w:tab/>
-      </w:r>
-      <w:r>
-        <w:rPr>
-          <w:rFonts w:ascii="TH Sarabun New" w:hAnsi="TH Sarabun New" w:cs="TH Sarabun New"/>
-          <w:sz w:val="32"/>
-          <w:szCs w:val="32"/>
-        </w:rPr>
-        <w:t>{{chkgroup2_11}}</w:t>
-      </w:r>
-      <w:r>
-        <w:rPr>
-          <w:rFonts w:ascii="TH Sarabun New" w:hAnsi="TH Sarabun New" w:cs="TH Sarabun New"/>
-          <w:sz w:val="32"/>
-          <w:szCs w:val="32"/>
-          <w:cs/>
-        </w:rPr>
-        <w:tab/>
-      </w:r>
-      <w:r>
-        <w:rPr>
-          <w:rFonts w:ascii="TH Sarabun New" w:hAnsi="TH Sarabun New" w:cs="TH Sarabun New"/>
-          <w:sz w:val="32"/>
-          <w:szCs w:val="32"/>
-          <w:cs/>
-        </w:rPr>
-        <w:t xml:space="preserve"> ผลงานนวัตกรรม</w:t>
+        <w:t>{{chkgroup2_12}}</w:t>
+      </w:r>
+      <w:r>
+        <w:rPr>
+          <w:rFonts w:ascii="TH Sarabun New" w:hAnsi="TH Sarabun New" w:cs="TH Sarabun New"/>
+          <w:sz w:val="32"/>
+          <w:szCs w:val="32"/>
+          <w:cs/>
+        </w:rPr>
+        <w:t xml:space="preserve">ผลงานรับใช้ท้องถิ่นและสังคม </w:t>
       </w:r>
     </w:p>
     <w:p>
@@ -1199,42 +1185,6 @@
           <w:rFonts w:ascii="TH Sarabun New" w:hAnsi="TH Sarabun New" w:cs="TH Sarabun New"/>
           <w:sz w:val="32"/>
           <w:szCs w:val="32"/>
-        </w:rPr>
-        <w:t>{{chkgroup2_12}}</w:t>
-      </w:r>
-      <w:r>
-        <w:rPr>
-          <w:rFonts w:ascii="TH Sarabun New" w:hAnsi="TH Sarabun New" w:cs="TH Sarabun New"/>
-          <w:sz w:val="32"/>
-          <w:szCs w:val="32"/>
-          <w:cs/>
-        </w:rPr>
-        <w:tab/>
-      </w:r>
-      <w:r>
-        <w:rPr>
-          <w:rFonts w:ascii="TH Sarabun New" w:hAnsi="TH Sarabun New" w:cs="TH Sarabun New"/>
-          <w:sz w:val="32"/>
-          <w:szCs w:val="32"/>
-          <w:cs/>
-        </w:rPr>
-        <w:t xml:space="preserve">ผลงานรับใช้ท้องถิ่นและสังคม </w:t>
-      </w:r>
-    </w:p>
-    <w:p>
-      <w:pPr>
-        <w:spacing w:after="0" w:line="276" w:lineRule="auto"/>
-        <w:rPr>
-          <w:rFonts w:ascii="TH Sarabun New" w:hAnsi="TH Sarabun New" w:cs="TH Sarabun New"/>
-          <w:sz w:val="32"/>
-          <w:szCs w:val="32"/>
-        </w:rPr>
-      </w:pPr>
-      <w:r>
-        <w:rPr>
-          <w:rFonts w:ascii="TH Sarabun New" w:hAnsi="TH Sarabun New" w:cs="TH Sarabun New"/>
-          <w:sz w:val="32"/>
-          <w:szCs w:val="32"/>
           <w:cs/>
         </w:rPr>
         <w:t>กลุ่มที่</w:t>
@@ -1264,7 +1214,31 @@
           <w:szCs w:val="32"/>
           <w:cs/>
         </w:rPr>
-        <w:tab/>
+        <w:t xml:space="preserve">. </w:t>
+      </w:r>
+      <w:r>
+        <w:rPr>
+          <w:rFonts w:ascii="TH Sarabun New" w:hAnsi="TH Sarabun New" w:cs="TH Sarabun New"/>
+          <w:sz w:val="32"/>
+          <w:szCs w:val="32"/>
+        </w:rPr>
+        <w:t xml:space="preserve">      </w:t>
+      </w:r>
+      <w:r>
+        <w:rPr>
+          <w:rFonts w:ascii="TH Sarabun New" w:hAnsi="TH Sarabun New" w:cs="TH Sarabun New"/>
+          <w:sz w:val="32"/>
+          <w:szCs w:val="32"/>
+        </w:rPr>
+        <w:t xml:space="preserve"> </w:t>
+      </w:r>
+      <w:r>
+        <w:rPr>
+          <w:rFonts w:ascii="TH Sarabun New" w:hAnsi="TH Sarabun New" w:cs="TH Sarabun New"/>
+          <w:sz w:val="32"/>
+          <w:szCs w:val="32"/>
+        </w:rPr>
+        <w:t xml:space="preserve"> </w:t>
       </w:r>
       <w:r>
         <w:rPr>
@@ -1312,7 +1286,7 @@
         <w:spacing w:after="0" w:line="276" w:lineRule="auto"/>
         <w:ind w:left="720" w:firstLine="720"/>
         <w:rPr>
-          <w:rFonts w:ascii="TH Sarabun New" w:hAnsi="TH Sarabun New" w:cs="TH Sarabun New" w:hint="cs"/>
+          <w:rFonts w:ascii="TH Sarabun New" w:hAnsi="TH Sarabun New" w:cs="TH Sarabun New"/>
           <w:sz w:val="32"/>
           <w:szCs w:val="32"/>
         </w:rPr>
@@ -3630,7 +3604,7 @@
         <w:spacing w:after="0" w:line="240" w:lineRule="auto"/>
         <w:jc w:val="center"/>
         <w:rPr>
-          <w:rFonts w:ascii="TH Sarabun New" w:hAnsi="TH Sarabun New" w:cs="TH Sarabun New"/>
+          <w:rFonts w:ascii="TH Sarabun New" w:hAnsi="TH Sarabun New" w:cs="TH Sarabun New" w:hint="cs"/>
           <w:color w:val="000000" w:themeColor="text1"/>
           <w:sz w:val="32"/>
           <w:szCs w:val="32"/>
@@ -3675,15 +3649,111 @@
         </w:rPr>
         <w:t>Corresponding author)</w:t>
       </w:r>
-      <w:r>
+    </w:p>
+    <w:p>
+      <w:pPr>
+        <w:spacing w:after="0" w:line="240" w:lineRule="auto"/>
+        <w:jc w:val="center"/>
         <w:rPr>
           <w:rFonts w:ascii="TH Sarabun New" w:hAnsi="TH Sarabun New" w:cs="TH Sarabun New"/>
           <w:color w:val="000000" w:themeColor="text1"/>
           <w:sz w:val="32"/>
           <w:szCs w:val="32"/>
-          <w:cs/>
-        </w:rPr>
-        <w:t xml:space="preserve"> </w:t>
+        </w:rPr>
+      </w:pPr>
+    </w:p>
+    <w:p>
+      <w:pPr>
+        <w:spacing w:after="0" w:line="240" w:lineRule="auto"/>
+        <w:jc w:val="center"/>
+        <w:rPr>
+          <w:rFonts w:ascii="TH Sarabun New" w:hAnsi="TH Sarabun New" w:cs="TH Sarabun New"/>
+          <w:color w:val="000000" w:themeColor="text1"/>
+          <w:sz w:val="32"/>
+          <w:szCs w:val="32"/>
+        </w:rPr>
+      </w:pPr>
+      <w:r>
+        <w:rPr>
+          <w:rFonts w:ascii="TH Sarabun New" w:hAnsi="TH Sarabun New" w:cs="TH Sarabun New"/>
+          <w:color w:val="000000" w:themeColor="text1"/>
+          <w:sz w:val="32"/>
+          <w:szCs w:val="32"/>
+          <w:cs/>
+        </w:rPr>
+        <w:t>ลงชื่อ.............................................</w:t>
+      </w:r>
+    </w:p>
+    <w:p>
+      <w:pPr>
+        <w:spacing w:after="0" w:line="240" w:lineRule="auto"/>
+        <w:jc w:val="center"/>
+        <w:rPr>
+          <w:rFonts w:ascii="TH Sarabun New" w:hAnsi="TH Sarabun New" w:cs="TH Sarabun New"/>
+          <w:color w:val="000000" w:themeColor="text1"/>
+          <w:sz w:val="32"/>
+          <w:szCs w:val="32"/>
+        </w:rPr>
+      </w:pPr>
+      <w:r>
+        <w:rPr>
+          <w:rFonts w:ascii="TH Sarabun New" w:hAnsi="TH Sarabun New" w:cs="TH Sarabun New"/>
+          <w:color w:val="000000" w:themeColor="text1"/>
+          <w:sz w:val="32"/>
+          <w:szCs w:val="32"/>
+          <w:cs/>
+        </w:rPr>
+        <w:t>(</w:t>
+      </w:r>
+      <w:r>
+        <w:rPr>
+          <w:rFonts w:ascii="TH Sarabun New" w:hAnsi="TH Sarabun New" w:cs="TH Sarabun New"/>
+          <w:color w:val="000000" w:themeColor="text1"/>
+          <w:sz w:val="32"/>
+          <w:szCs w:val="32"/>
+        </w:rPr>
+        <w:t>{{corres_name}}</w:t>
+      </w:r>
+      <w:r>
+        <w:rPr>
+          <w:rFonts w:ascii="TH Sarabun New" w:hAnsi="TH Sarabun New" w:cs="TH Sarabun New"/>
+          <w:color w:val="000000" w:themeColor="text1"/>
+          <w:sz w:val="32"/>
+          <w:szCs w:val="32"/>
+          <w:cs/>
+        </w:rPr>
+        <w:t>)</w:t>
+      </w:r>
+    </w:p>
+    <w:p>
+      <w:pPr>
+        <w:spacing w:after="0" w:line="240" w:lineRule="auto"/>
+        <w:jc w:val="center"/>
+        <w:rPr>
+          <w:rFonts w:ascii="TH Sarabun New" w:hAnsi="TH Sarabun New" w:cs="TH Sarabun New" w:hint="cs"/>
+          <w:color w:val="000000" w:themeColor="text1"/>
+          <w:sz w:val="32"/>
+          <w:szCs w:val="32"/>
+        </w:rPr>
+      </w:pPr>
+      <w:r>
+        <w:rPr>
+          <w:rFonts w:ascii="TH Sarabun New" w:hAnsi="TH Sarabun New" w:cs="TH Sarabun New"/>
+          <w:color w:val="000000" w:themeColor="text1"/>
+          <w:sz w:val="32"/>
+          <w:szCs w:val="32"/>
+          <w:cs/>
+        </w:rPr>
+        <w:t>ผู้ประพันธ์บรรณกิจ (</w:t>
+      </w:r>
+      <w:r>
+        <w:rPr>
+          <w:rFonts w:ascii="TH Sarabun New" w:hAnsi="TH Sarabun New" w:cs="TH Sarabun New"/>
+          <w:color w:val="000000" w:themeColor="text1"/>
+          <w:sz w:val="32"/>
+          <w:szCs w:val="32"/>
+        </w:rPr>
+        <w:t>Corresponding author)</w:t>
       </w:r>
     </w:p>
     <w:p>
@@ -4627,6 +4697,7 @@
   <w:style w:type="character" w:default="1" w:styleId="DefaultParagraphFont">
     <w:name w:val="Default Paragraph Font"/>
     <w:uiPriority w:val="1"/>
+    <w:semiHidden/>
     <w:unhideWhenUsed/>
   </w:style>
   <w:style w:type="table" w:default="1" w:styleId="TableNormal">

</xml_diff>